<commit_message>
chore: ajustar docs e higiene de repositório
Padroniza a geração de valores monetários em pt-BR e atualiza a documentação/estrutura de Docker. Também remove arquivos sensíveis do versionamento para manter o repositório pronto para colaboração.

Made-with: Cursor
</commit_message>
<xml_diff>
--- a/Proposta OS 'AnoOS'-'NúmeroOs' - 'TítuloOS'.docx
+++ b/Proposta OS 'AnoOS'-'NúmeroOs' - 'TítuloOS'.docx
@@ -782,7 +782,19 @@
               <w:rPr>
                 <w:rFonts w:ascii="Inter" w:eastAsia="Inter" w:hAnsi="Inter" w:cs="Inter"/>
               </w:rPr>
-              <w:t xml:space="preserve">Valor estimado: </w:t>
+              <w:t>Valor estimado:</w:t>
+            </w:r>
+            <w:r>
+              <w:rPr>
+                <w:rFonts w:ascii="Inter" w:eastAsia="Inter" w:hAnsi="Inter" w:cs="Inter"/>
+              </w:rPr>
+              <w:t xml:space="preserve"> R$</w:t>
+            </w:r>
+            <w:r>
+              <w:rPr>
+                <w:rFonts w:ascii="Inter" w:eastAsia="Inter" w:hAnsi="Inter" w:cs="Inter"/>
+              </w:rPr>
+              <w:t xml:space="preserve"> </w:t>
             </w:r>
             <w:r>
               <w:rPr>
@@ -6083,28 +6095,28 @@
 </file>
 
 <file path=customXml/item1.xml><?xml version="1.0" encoding="utf-8"?>
+<b:Sources xmlns:b="http://schemas.openxmlformats.org/officeDocument/2006/bibliography" xmlns="http://schemas.openxmlformats.org/officeDocument/2006/bibliography" SelectedStyle="\APASixthEditionOfficeOnline.xsl" StyleName="APA" Version="6"/>
+</file>
+
+<file path=customXml/item2.xml><?xml version="1.0" encoding="utf-8"?>
 <go:gDocsCustomXmlDataStorage xmlns:go="http://customooxmlschemas.google.com/" xmlns:r="http://schemas.openxmlformats.org/officeDocument/2006/relationships" uri="GoogleDocsCustomDataVersion2">
   <go:docsCustomData xmlns:go="http://customooxmlschemas.google.com/" roundtripDataSignature="AMtx7mi/1Pm7YDcsN/xLHComJDW1wGU04g==">CgMxLjAyDmguNW1hYWdxeXE2cjZiMg5oLjg1YjhsamQ4YTRhcDIOaC5vc243azRwazNidXUyDmguMzB6Z2s5YWVoanJmOAByITFKbFRLQ0tDMkJSd3ltQnEzUzZ1ZmZqS0ZRM2xOaUtIaw==</go:docsCustomData>
 </go:gDocsCustomXmlDataStorage>
 </file>
 
-<file path=customXml/item2.xml><?xml version="1.0" encoding="utf-8"?>
-<b:Sources xmlns:b="http://schemas.openxmlformats.org/officeDocument/2006/bibliography" xmlns="http://schemas.openxmlformats.org/officeDocument/2006/bibliography" SelectedStyle="\APASixthEditionOfficeOnline.xsl" StyleName="APA" Version="6"/>
+<file path=customXml/itemProps1.xml><?xml version="1.0" encoding="utf-8"?>
+<ds:datastoreItem xmlns:ds="http://schemas.openxmlformats.org/officeDocument/2006/customXml" ds:itemID="{3EA1C7F2-AEB5-46A9-B4CE-46F143755D0E}">
+  <ds:schemaRefs>
+    <ds:schemaRef ds:uri="http://schemas.openxmlformats.org/officeDocument/2006/bibliography"/>
+  </ds:schemaRefs>
+</ds:datastoreItem>
 </file>
 
-<file path=customXml/itemProps1.xml><?xml version="1.0" encoding="utf-8"?>
+<file path=customXml/itemProps2.xml><?xml version="1.0" encoding="utf-8"?>
 <ds:datastoreItem xmlns:ds="http://schemas.openxmlformats.org/officeDocument/2006/customXml" ds:itemID="{11111111-1234-1234-1234-123412341234}">
   <ds:schemaRefs>
     <ds:schemaRef ds:uri="http://customooxmlschemas.google.com/"/>
     <ds:schemaRef ds:uri="http://schemas.openxmlformats.org/officeDocument/2006/relationships"/>
   </ds:schemaRefs>
 </ds:datastoreItem>
-</file>
-
-<file path=customXml/itemProps2.xml><?xml version="1.0" encoding="utf-8"?>
-<ds:datastoreItem xmlns:ds="http://schemas.openxmlformats.org/officeDocument/2006/customXml" ds:itemID="{3EA1C7F2-AEB5-46A9-B4CE-46F143755D0E}">
-  <ds:schemaRefs>
-    <ds:schemaRef ds:uri="http://schemas.openxmlformats.org/officeDocument/2006/bibliography"/>
-  </ds:schemaRefs>
-</ds:datastoreItem>
 </file>
</xml_diff>